<commit_message>
Changed email to heinzarniaung.dev@gmail.com
</commit_message>
<xml_diff>
--- a/Resume - 2025.docx
+++ b/Resume - 2025.docx
@@ -36,7 +36,7 @@
             <w:rStyle w:val="Hyperlink"/>
             <w:rFonts w:cs="Tahoma"/>
           </w:rPr>
-          <w:t>heinzarniaung.mm@gmail.com</w:t>
+          <w:t>heinzarniaung.dev@gmail.com</w:t>
         </w:r>
       </w:hyperlink>
       <w:r>
@@ -85,7 +85,7 @@
         <w:pBdr>
           <w:bottom w:val="single" w:sz="6" w:space="1" w:color="auto"/>
         </w:pBdr>
-        <w:spacing w:afterLines="20" w:after="48" w:line="240" w:lineRule="auto"/>
+        <w:spacing w:before="120" w:afterLines="20" w:after="48" w:line="240" w:lineRule="auto"/>
         <w:rPr>
           <w:rFonts w:ascii="Georgia" w:hAnsi="Georgia" w:cs="Tahoma"/>
           <w:color w:val="000000" w:themeColor="text1"/>
@@ -190,13 +190,16 @@
         <w:t>Major:</w:t>
       </w:r>
       <w:r>
-        <w:t xml:space="preserve"> Computer Science &amp; Applied Math &amp; Statistics</w:t>
-      </w:r>
-      <w:r>
-        <w:tab/>
-      </w:r>
-      <w:r>
-        <w:tab/>
+        <w:t xml:space="preserve"> Computer Science </w:t>
+      </w:r>
+      <w:r>
+        <w:t>+</w:t>
+      </w:r>
+      <w:r>
+        <w:t xml:space="preserve"> Applied Math &amp; Statistics</w:t>
+      </w:r>
+      <w:r>
+        <w:t xml:space="preserve"> (Data Science)</w:t>
       </w:r>
       <w:r>
         <w:tab/>
@@ -263,7 +266,13 @@
         <w:t xml:space="preserve">Relevant Coursework: </w:t>
       </w:r>
       <w:r>
-        <w:t>Full Stack Development, Programming Abstractions, Systems Fundamentals. Software Security, Algorithms, Statistics &amp; Probability</w:t>
+        <w:t xml:space="preserve">Full Stack Development, </w:t>
+      </w:r>
+      <w:r>
+        <w:t xml:space="preserve">Software Security, </w:t>
+      </w:r>
+      <w:r>
+        <w:t>Programming Abstractions, Systems Fundamentals, Algorithms, Statistics &amp; Probability</w:t>
       </w:r>
     </w:p>
     <w:p>
@@ -303,30 +312,14 @@
           <w:b/>
           <w:bCs/>
         </w:rPr>
-        <w:t xml:space="preserve">Ethos </w:t>
-      </w:r>
-      <w:proofErr w:type="gramStart"/>
-      <w:r>
-        <w:rPr>
-          <w:b/>
-          <w:bCs/>
-        </w:rPr>
-        <w:t>Lab</w:t>
-      </w:r>
-      <w:r>
-        <w:rPr>
-          <w:b/>
-          <w:bCs/>
-        </w:rPr>
-        <w:t xml:space="preserve"> @</w:t>
-      </w:r>
-      <w:proofErr w:type="gramEnd"/>
-      <w:r>
-        <w:rPr>
-          <w:b/>
-          <w:bCs/>
-        </w:rPr>
-        <w:t xml:space="preserve"> Department of Computer Science</w:t>
+        <w:t>Ethos Lab</w:t>
+      </w:r>
+      <w:r>
+        <w:rPr>
+          <w:b/>
+          <w:bCs/>
+        </w:rPr>
+        <w:t xml:space="preserve"> @ Department of Computer Science</w:t>
       </w:r>
       <w:r>
         <w:rPr>
@@ -387,14 +380,7 @@
           <w:i/>
           <w:iCs/>
         </w:rPr>
-        <w:t>Undergraduate Research</w:t>
-      </w:r>
-      <w:r>
-        <w:rPr>
-          <w:i/>
-          <w:iCs/>
-        </w:rPr>
-        <w:t xml:space="preserve"> Assistant</w:t>
+        <w:t>Undergraduate Research Assistant</w:t>
       </w:r>
       <w:r>
         <w:rPr>
@@ -438,21 +424,7 @@
           <w:iCs/>
         </w:rPr>
         <w:tab/>
-        <w:t xml:space="preserve">           </w:t>
-      </w:r>
-      <w:r>
-        <w:rPr>
-          <w:i/>
-          <w:iCs/>
-        </w:rPr>
-        <w:t>Sep</w:t>
-      </w:r>
-      <w:r>
-        <w:rPr>
-          <w:i/>
-          <w:iCs/>
-        </w:rPr>
-        <w:t xml:space="preserve"> 2025 –Present</w:t>
+        <w:t xml:space="preserve">           Sep 2025 –Present</w:t>
       </w:r>
     </w:p>
     <w:p>
@@ -713,7 +685,7 @@
         <w:spacing w:afterLines="20" w:after="48" w:line="240" w:lineRule="auto"/>
       </w:pPr>
       <w:r>
-        <w:t xml:space="preserve">Held midterm reviews </w:t>
+        <w:t>Conducted comprehensive midterm review sessions, creating practice problems and visual explanations to clarify challenging concepts.</w:t>
       </w:r>
     </w:p>
     <w:p>
@@ -1286,6 +1258,12 @@
           <w:rFonts w:cs="Tahoma"/>
         </w:rPr>
         <w:t>, ESP32</w:t>
+      </w:r>
+      <w:r>
+        <w:rPr>
+          <w:rFonts w:cs="Tahoma"/>
+        </w:rPr>
+        <w:t xml:space="preserve"> </w:t>
       </w:r>
     </w:p>
     <w:p>
@@ -2443,15 +2421,6 @@
   </w:num>
   <w:num w:numId="11" w16cid:durableId="1742292906">
     <w:abstractNumId w:val="6"/>
-    <w:lvlOverride w:ilvl="0"/>
-    <w:lvlOverride w:ilvl="1"/>
-    <w:lvlOverride w:ilvl="2"/>
-    <w:lvlOverride w:ilvl="3"/>
-    <w:lvlOverride w:ilvl="4"/>
-    <w:lvlOverride w:ilvl="5"/>
-    <w:lvlOverride w:ilvl="6"/>
-    <w:lvlOverride w:ilvl="7"/>
-    <w:lvlOverride w:ilvl="8"/>
   </w:num>
 </w:numbering>
 </file>
@@ -3064,6 +3033,7 @@
   <w:style w:type="character" w:default="1" w:styleId="DefaultParagraphFont">
     <w:name w:val="Default Paragraph Font"/>
     <w:uiPriority w:val="1"/>
+    <w:semiHidden/>
     <w:unhideWhenUsed/>
   </w:style>
   <w:style w:type="table" w:default="1" w:styleId="TableNormal">

</xml_diff>